<commit_message>
feat: refresh Photoshop courseware v8 and remove retired topics
</commit_message>
<xml_diff>
--- a/courseware/LP-Generative-AI-Visuals-in-Photoshop-and-Firefly.docx
+++ b/courseware/LP-Generative-AI-Visuals-in-Photoshop-and-Firefly.docx
@@ -179,7 +179,7 @@
           <w:color w:val="1F6FEB"/>
           <w:sz w:val="24"/>
         </w:rPr>
-        <w:t>Version 7</w:t>
+        <w:t>Version 8</w:t>
       </w:r>
     </w:p>
     <w:p>
@@ -352,7 +352,7 @@
               <w:rPr>
                 <w:sz w:val="19"/>
               </w:rPr>
-              <w:t>7</w:t>
+              <w:t>8</w:t>
             </w:r>
           </w:p>
         </w:tc>
@@ -366,7 +366,7 @@
               <w:rPr>
                 <w:sz w:val="19"/>
               </w:rPr>
-              <w:t>21 August 2026</w:t>
+              <w:t>13 October 2026</w:t>
             </w:r>
           </w:p>
         </w:tc>
@@ -423,10 +423,192 @@
         <w:fldChar w:fldCharType="begin"/>
         <w:instrText xml:space="preserve">TOC \o "1-3" \h \z \u</w:instrText>
         <w:fldChar w:fldCharType="separate"/>
-        <w:t>Right-click and choose “Update Field”, or press F9, to build the table of contents.</w:t>
+        <w:t>Current verified contents are listed below. Update this editable TOC field in Word to refresh page references.</w:t>
         <w:fldChar w:fldCharType="end"/>
       </w:r>
     </w:p>
+    <w:tbl>
+      <w:tblPr>
+        <w:tblStyle w:val="TableGrid"/>
+        <w:tblW w:type="auto" w:w="0"/>
+        <w:jc w:val="center"/>
+        <w:tblLayout w:type="fixed"/>
+        <w:tblLook w:firstColumn="1" w:firstRow="1" w:lastColumn="0" w:lastRow="0" w:noHBand="0" w:noVBand="1" w:val="04A0"/>
+      </w:tblPr>
+      <w:tblGrid>
+        <w:gridCol w:w="4320"/>
+        <w:gridCol w:w="4320"/>
+      </w:tblGrid>
+      <w:tr>
+        <w:trPr>
+          <w:tblHeader w:val="true"/>
+        </w:trPr>
+        <w:tc>
+          <w:tcPr>
+            <w:tcW w:type="dxa" w:w="8496"/>
+            <w:shd w:val="clear" w:color="auto" w:fill="224AF4"/>
+          </w:tcPr>
+          <w:p>
+            <w:r>
+              <w:rPr>
+                <w:b/>
+                <w:color w:val="FFFFFF"/>
+                <w:sz w:val="20"/>
+              </w:rPr>
+              <w:t>Section</w:t>
+            </w:r>
+          </w:p>
+        </w:tc>
+        <w:tc>
+          <w:tcPr>
+            <w:tcW w:type="dxa" w:w="1008"/>
+            <w:shd w:val="clear" w:color="auto" w:fill="224AF4"/>
+          </w:tcPr>
+          <w:p>
+            <w:r>
+              <w:rPr>
+                <w:b/>
+                <w:color w:val="FFFFFF"/>
+                <w:sz w:val="20"/>
+              </w:rPr>
+              <w:t>Page</w:t>
+            </w:r>
+          </w:p>
+        </w:tc>
+      </w:tr>
+      <w:tr>
+        <w:trPr>
+          <w:cantSplit/>
+        </w:trPr>
+        <w:tc>
+          <w:tcPr>
+            <w:tcW w:type="dxa" w:w="8496"/>
+            <w:vAlign w:val="center"/>
+          </w:tcPr>
+          <w:p>
+            <w:r>
+              <w:rPr>
+                <w:sz w:val="20"/>
+              </w:rPr>
+              <w:t>Course Information</w:t>
+            </w:r>
+          </w:p>
+        </w:tc>
+        <w:tc>
+          <w:tcPr>
+            <w:tcW w:type="dxa" w:w="1008"/>
+            <w:vAlign w:val="center"/>
+          </w:tcPr>
+          <w:p>
+            <w:r>
+              <w:rPr>
+                <w:sz w:val="20"/>
+              </w:rPr>
+              <w:t>4</w:t>
+            </w:r>
+          </w:p>
+        </w:tc>
+      </w:tr>
+      <w:tr>
+        <w:trPr>
+          <w:cantSplit/>
+        </w:trPr>
+        <w:tc>
+          <w:tcPr>
+            <w:tcW w:type="dxa" w:w="8496"/>
+            <w:vAlign w:val="center"/>
+          </w:tcPr>
+          <w:p>
+            <w:r>
+              <w:rPr>
+                <w:sz w:val="20"/>
+              </w:rPr>
+              <w:t>Learning Outcomes and Assessment</w:t>
+            </w:r>
+          </w:p>
+        </w:tc>
+        <w:tc>
+          <w:tcPr>
+            <w:tcW w:type="dxa" w:w="1008"/>
+            <w:vAlign w:val="center"/>
+          </w:tcPr>
+          <w:p>
+            <w:r>
+              <w:rPr>
+                <w:sz w:val="20"/>
+              </w:rPr>
+              <w:t>4</w:t>
+            </w:r>
+          </w:p>
+        </w:tc>
+      </w:tr>
+      <w:tr>
+        <w:trPr>
+          <w:cantSplit/>
+        </w:trPr>
+        <w:tc>
+          <w:tcPr>
+            <w:tcW w:type="dxa" w:w="8496"/>
+            <w:vAlign w:val="center"/>
+          </w:tcPr>
+          <w:p>
+            <w:r>
+              <w:rPr>
+                <w:sz w:val="20"/>
+              </w:rPr>
+              <w:t>Two-Day Schedule</w:t>
+            </w:r>
+          </w:p>
+        </w:tc>
+        <w:tc>
+          <w:tcPr>
+            <w:tcW w:type="dxa" w:w="1008"/>
+            <w:vAlign w:val="center"/>
+          </w:tcPr>
+          <w:p>
+            <w:r>
+              <w:rPr>
+                <w:sz w:val="20"/>
+              </w:rPr>
+              <w:t>4</w:t>
+            </w:r>
+          </w:p>
+        </w:tc>
+      </w:tr>
+      <w:tr>
+        <w:trPr>
+          <w:cantSplit/>
+        </w:trPr>
+        <w:tc>
+          <w:tcPr>
+            <w:tcW w:type="dxa" w:w="8496"/>
+            <w:vAlign w:val="center"/>
+          </w:tcPr>
+          <w:p>
+            <w:r>
+              <w:rPr>
+                <w:sz w:val="20"/>
+              </w:rPr>
+              <w:t>Lab Alignment</w:t>
+            </w:r>
+          </w:p>
+        </w:tc>
+        <w:tc>
+          <w:tcPr>
+            <w:tcW w:type="dxa" w:w="1008"/>
+            <w:vAlign w:val="center"/>
+          </w:tcPr>
+          <w:p>
+            <w:r>
+              <w:rPr>
+                <w:sz w:val="20"/>
+              </w:rPr>
+              <w:t>6</w:t>
+            </w:r>
+          </w:p>
+        </w:tc>
+      </w:tr>
+    </w:tbl>
     <w:p>
       <w:r>
         <w:br w:type="page"/>
@@ -681,7 +863,7 @@
               <w:rPr>
                 <w:sz w:val="19"/>
               </w:rPr>
-              <w:t>Tertiary Infotech Academy Pte Ltd · 201200789K</w:t>
+              <w:t>Tertiary Infotech Academy Pte Ltd · 201200696W</w:t>
             </w:r>
           </w:p>
         </w:tc>
@@ -714,7 +896,7 @@
               <w:rPr>
                 <w:sz w:val="19"/>
               </w:rPr>
-              <w:t>v7 · 21 August 2026</w:t>
+              <w:t>v8 · 13 October 2026</w:t>
             </w:r>
           </w:p>
         </w:tc>
@@ -798,6 +980,11 @@
       </w:pPr>
       <w:r>
         <w:t>Two-Day Schedule</w:t>
+      </w:r>
+    </w:p>
+    <w:p>
+      <w:r>
+        <w:t>The schedule comprises 14 hours of facilitated training/contact time, inclusive of attendance, tea breaks and assessment briefing, plus 2 hours of summative assessment. Learning-unit allocation is LU1 3 hours, LU2 3 hours, LU3 4 hours and LU4 4 hours.</w:t>
       </w:r>
     </w:p>
     <w:p>
@@ -1147,7 +1334,7 @@
               <w:rPr>
                 <w:sz w:val="16"/>
               </w:rPr>
-              <w:t>10:45–12:30</w:t>
+              <w:t>10:45–12:00</w:t>
             </w:r>
           </w:p>
         </w:tc>
@@ -1161,7 +1348,7 @@
               <w:rPr>
                 <w:sz w:val="16"/>
               </w:rPr>
-              <w:t>105 min</w:t>
+              <w:t>75 min</w:t>
             </w:r>
           </w:p>
         </w:tc>
@@ -1189,7 +1376,7 @@
               <w:rPr>
                 <w:sz w:val="16"/>
               </w:rPr>
-              <w:t>Prompt iteration, design principles and responsible provenance; Labs 1–2</w:t>
+              <w:t>Labs 1–2 and Topic 1 evidence checkpoint</w:t>
             </w:r>
           </w:p>
         </w:tc>
@@ -1203,7 +1390,7 @@
               <w:rPr>
                 <w:sz w:val="16"/>
               </w:rPr>
-              <w:t>Lab slides: 37, 38</w:t>
+              <w:t>Lab slides: 61, 62</w:t>
             </w:r>
           </w:p>
         </w:tc>
@@ -1222,7 +1409,7 @@
               <w:rPr>
                 <w:sz w:val="16"/>
               </w:rPr>
-              <w:t>12:30–13:00</w:t>
+              <w:t>12:00–13:00</w:t>
             </w:r>
           </w:p>
         </w:tc>
@@ -1236,7 +1423,7 @@
               <w:rPr>
                 <w:sz w:val="16"/>
               </w:rPr>
-              <w:t>30 min</w:t>
+              <w:t>60 min</w:t>
             </w:r>
           </w:p>
         </w:tc>
@@ -1250,7 +1437,7 @@
               <w:rPr>
                 <w:sz w:val="16"/>
               </w:rPr>
-              <w:t>Practice</w:t>
+              <w:t>Topic 2</w:t>
             </w:r>
           </w:p>
         </w:tc>
@@ -1264,7 +1451,7 @@
               <w:rPr>
                 <w:sz w:val="16"/>
               </w:rPr>
-              <w:t>Lab evidence review and Topic 1 checkpoint</w:t>
+              <w:t>Firefly models, content controls, composition and style references</w:t>
             </w:r>
           </w:p>
         </w:tc>
@@ -1278,7 +1465,7 @@
               <w:rPr>
                 <w:sz w:val="16"/>
               </w:rPr>
-              <w:t>Labs: 37, 38</w:t>
+              <w:t>Topic 2: slide 64</w:t>
             </w:r>
           </w:p>
         </w:tc>
@@ -1400,7 +1587,7 @@
               <w:rPr>
                 <w:sz w:val="16"/>
               </w:rPr>
-              <w:t>Topic 2</w:t>
+              <w:t>Topic 2 + Labs</w:t>
             </w:r>
           </w:p>
         </w:tc>
@@ -1414,7 +1601,7 @@
               <w:rPr>
                 <w:sz w:val="16"/>
               </w:rPr>
-              <w:t>Firefly models, content controls, composition and style references</w:t>
+              <w:t>Labs 3–4: reference-controlled storyboard and task flow</w:t>
             </w:r>
           </w:p>
         </w:tc>
@@ -1428,7 +1615,7 @@
               <w:rPr>
                 <w:sz w:val="16"/>
               </w:rPr>
-              <w:t>Topic 2: slide 40</w:t>
+              <w:t>Lab slides: 106, 107</w:t>
             </w:r>
           </w:p>
         </w:tc>
@@ -1522,7 +1709,7 @@
               <w:rPr>
                 <w:sz w:val="16"/>
               </w:rPr>
-              <w:t>15:45–17:30</w:t>
+              <w:t>15:45–16:00</w:t>
             </w:r>
           </w:p>
         </w:tc>
@@ -1536,7 +1723,7 @@
               <w:rPr>
                 <w:sz w:val="16"/>
               </w:rPr>
-              <w:t>105 min</w:t>
+              <w:t>15 min</w:t>
             </w:r>
           </w:p>
         </w:tc>
@@ -1550,7 +1737,7 @@
               <w:rPr>
                 <w:sz w:val="16"/>
               </w:rPr>
-              <w:t>Topic 2 + Labs</w:t>
+              <w:t>Topic 2</w:t>
             </w:r>
           </w:p>
         </w:tc>
@@ -1564,7 +1751,7 @@
               <w:rPr>
                 <w:sz w:val="16"/>
               </w:rPr>
-              <w:t>Storyboard architecture, task flow and editable text; Labs 3–4</w:t>
+              <w:t>Peer review and Topic 2 checkpoint</w:t>
             </w:r>
           </w:p>
         </w:tc>
@@ -1578,7 +1765,7 @@
               <w:rPr>
                 <w:sz w:val="16"/>
               </w:rPr>
-              <w:t>Lab slides: 58, 59</w:t>
+              <w:t>Labs: 106, 107</w:t>
             </w:r>
           </w:p>
         </w:tc>
@@ -1597,7 +1784,82 @@
               <w:rPr>
                 <w:sz w:val="16"/>
               </w:rPr>
-              <w:t>17:30–18:00</w:t>
+              <w:t>16:00–17:15</w:t>
+            </w:r>
+          </w:p>
+        </w:tc>
+        <w:tc>
+          <w:tcPr>
+            <w:tcW w:type="dxa" w:w="893"/>
+            <w:vAlign w:val="center"/>
+          </w:tcPr>
+          <w:p>
+            <w:r>
+              <w:rPr>
+                <w:sz w:val="16"/>
+              </w:rPr>
+              <w:t>75 min</w:t>
+            </w:r>
+          </w:p>
+        </w:tc>
+        <w:tc>
+          <w:tcPr>
+            <w:tcW w:type="dxa" w:w="1037"/>
+            <w:vAlign w:val="center"/>
+          </w:tcPr>
+          <w:p>
+            <w:r>
+              <w:rPr>
+                <w:sz w:val="16"/>
+              </w:rPr>
+              <w:t>Topic 3</w:t>
+            </w:r>
+          </w:p>
+        </w:tc>
+        <w:tc>
+          <w:tcPr>
+            <w:tcW w:type="dxa" w:w="4104"/>
+            <w:vAlign w:val="center"/>
+          </w:tcPr>
+          <w:p>
+            <w:r>
+              <w:rPr>
+                <w:sz w:val="16"/>
+              </w:rPr>
+              <w:t>Photoshop generative feature map, selections and Generative Fill</w:t>
+            </w:r>
+          </w:p>
+        </w:tc>
+        <w:tc>
+          <w:tcPr>
+            <w:tcW w:type="dxa" w:w="2088"/>
+            <w:vAlign w:val="center"/>
+          </w:tcPr>
+          <w:p>
+            <w:r>
+              <w:rPr>
+                <w:sz w:val="16"/>
+              </w:rPr>
+              <w:t>Topic 3: slide 109</w:t>
+            </w:r>
+          </w:p>
+        </w:tc>
+      </w:tr>
+      <w:tr>
+        <w:trPr>
+          <w:cantSplit/>
+        </w:trPr>
+        <w:tc>
+          <w:tcPr>
+            <w:tcW w:type="dxa" w:w="1037"/>
+            <w:vAlign w:val="center"/>
+          </w:tcPr>
+          <w:p>
+            <w:r>
+              <w:rPr>
+                <w:sz w:val="16"/>
+              </w:rPr>
+              <w:t>17:15–17:45</w:t>
             </w:r>
           </w:p>
         </w:tc>
@@ -1625,7 +1887,7 @@
               <w:rPr>
                 <w:sz w:val="16"/>
               </w:rPr>
-              <w:t>Recap</w:t>
+              <w:t>Topic 3 + Lab</w:t>
             </w:r>
           </w:p>
         </w:tc>
@@ -1639,7 +1901,7 @@
               <w:rPr>
                 <w:sz w:val="16"/>
               </w:rPr>
-              <w:t>Storyboard peer review, PM attendance and Day 1 close</w:t>
+              <w:t>Begin Lab 5: Generative Fill</w:t>
             </w:r>
           </w:p>
         </w:tc>
@@ -1653,7 +1915,82 @@
               <w:rPr>
                 <w:sz w:val="16"/>
               </w:rPr>
-              <w:t>Labs: 58, 59</w:t>
+              <w:t>Lab slide: 151</w:t>
+            </w:r>
+          </w:p>
+        </w:tc>
+      </w:tr>
+      <w:tr>
+        <w:trPr>
+          <w:cantSplit/>
+        </w:trPr>
+        <w:tc>
+          <w:tcPr>
+            <w:tcW w:type="dxa" w:w="1037"/>
+            <w:vAlign w:val="center"/>
+          </w:tcPr>
+          <w:p>
+            <w:r>
+              <w:rPr>
+                <w:sz w:val="16"/>
+              </w:rPr>
+              <w:t>17:45–18:00</w:t>
+            </w:r>
+          </w:p>
+        </w:tc>
+        <w:tc>
+          <w:tcPr>
+            <w:tcW w:type="dxa" w:w="893"/>
+            <w:vAlign w:val="center"/>
+          </w:tcPr>
+          <w:p>
+            <w:r>
+              <w:rPr>
+                <w:sz w:val="16"/>
+              </w:rPr>
+              <w:t>15 min</w:t>
+            </w:r>
+          </w:p>
+        </w:tc>
+        <w:tc>
+          <w:tcPr>
+            <w:tcW w:type="dxa" w:w="1037"/>
+            <w:vAlign w:val="center"/>
+          </w:tcPr>
+          <w:p>
+            <w:r>
+              <w:rPr>
+                <w:sz w:val="16"/>
+              </w:rPr>
+              <w:t>Admin</w:t>
+            </w:r>
+          </w:p>
+        </w:tc>
+        <w:tc>
+          <w:tcPr>
+            <w:tcW w:type="dxa" w:w="4104"/>
+            <w:vAlign w:val="center"/>
+          </w:tcPr>
+          <w:p>
+            <w:r>
+              <w:rPr>
+                <w:sz w:val="16"/>
+              </w:rPr>
+              <w:t>Reflection, evidence save and PM attendance</w:t>
+            </w:r>
+          </w:p>
+        </w:tc>
+        <w:tc>
+          <w:tcPr>
+            <w:tcW w:type="dxa" w:w="2088"/>
+            <w:vAlign w:val="center"/>
+          </w:tcPr>
+          <w:p>
+            <w:r>
+              <w:rPr>
+                <w:sz w:val="16"/>
+              </w:rPr>
+              <w:t>Day 1 close</w:t>
             </w:r>
           </w:p>
         </w:tc>
@@ -1884,7 +2221,7 @@
               <w:rPr>
                 <w:sz w:val="16"/>
               </w:rPr>
-              <w:t>Topic 3</w:t>
+              <w:t>Topic 3 + Labs</w:t>
             </w:r>
           </w:p>
         </w:tc>
@@ -1898,7 +2235,7 @@
               <w:rPr>
                 <w:sz w:val="16"/>
               </w:rPr>
-              <w:t>Photoshop generative feature map, selections and Generative Fill</w:t>
+              <w:t>Complete Labs 5–8: Fill, background, expand and reference control</w:t>
             </w:r>
           </w:p>
         </w:tc>
@@ -1912,7 +2249,7 @@
               <w:rPr>
                 <w:sz w:val="16"/>
               </w:rPr>
-              <w:t>Topic 3: slide 61</w:t>
+              <w:t>Labs: 151, 152, 153, 154</w:t>
             </w:r>
           </w:p>
         </w:tc>
@@ -2006,7 +2343,7 @@
               <w:rPr>
                 <w:sz w:val="16"/>
               </w:rPr>
-              <w:t>10:45–12:30</w:t>
+              <w:t>10:45–11:00</w:t>
             </w:r>
           </w:p>
         </w:tc>
@@ -2020,7 +2357,7 @@
               <w:rPr>
                 <w:sz w:val="16"/>
               </w:rPr>
-              <w:t>105 min</w:t>
+              <w:t>15 min</w:t>
             </w:r>
           </w:p>
         </w:tc>
@@ -2034,7 +2371,7 @@
               <w:rPr>
                 <w:sz w:val="16"/>
               </w:rPr>
-              <w:t>Topic 3 + Labs</w:t>
+              <w:t>Topic 3</w:t>
             </w:r>
           </w:p>
         </w:tc>
@@ -2048,7 +2385,7 @@
               <w:rPr>
                 <w:sz w:val="16"/>
               </w:rPr>
-              <w:t>Backgrounds, Harmonize, Expand and reference-guided editing; Labs 5–8</w:t>
+              <w:t>Aesthetic critique and Topic 3 checkpoint</w:t>
             </w:r>
           </w:p>
         </w:tc>
@@ -2062,7 +2399,7 @@
               <w:rPr>
                 <w:sz w:val="16"/>
               </w:rPr>
-              <w:t>Labs: 79, 80, 81, 82</w:t>
+              <w:t>Labs: 151, 152, 153, 154</w:t>
             </w:r>
           </w:p>
         </w:tc>
@@ -2081,7 +2418,7 @@
               <w:rPr>
                 <w:sz w:val="16"/>
               </w:rPr>
-              <w:t>12:30–13:00</w:t>
+              <w:t>11:00–12:30</w:t>
             </w:r>
           </w:p>
         </w:tc>
@@ -2095,7 +2432,7 @@
               <w:rPr>
                 <w:sz w:val="16"/>
               </w:rPr>
-              <w:t>30 min</w:t>
+              <w:t>90 min</w:t>
             </w:r>
           </w:p>
         </w:tc>
@@ -2109,7 +2446,7 @@
               <w:rPr>
                 <w:sz w:val="16"/>
               </w:rPr>
-              <w:t>Critique</w:t>
+              <w:t>Topic 4</w:t>
             </w:r>
           </w:p>
         </w:tc>
@@ -2123,7 +2460,7 @@
               <w:rPr>
                 <w:sz w:val="16"/>
               </w:rPr>
-              <w:t>Aesthetic critique and traceable enhancement checkpoint</w:t>
+              <w:t>Colour fundamentals, adjustment layers, restoration and delivery</w:t>
             </w:r>
           </w:p>
         </w:tc>
@@ -2137,7 +2474,7 @@
               <w:rPr>
                 <w:sz w:val="16"/>
               </w:rPr>
-              <w:t>Labs: 79, 80, 81, 82</w:t>
+              <w:t>Topic 4: slide 156</w:t>
             </w:r>
           </w:p>
         </w:tc>
@@ -2156,7 +2493,7 @@
               <w:rPr>
                 <w:sz w:val="16"/>
               </w:rPr>
-              <w:t>13:00–14:00</w:t>
+              <w:t>12:30–13:30</w:t>
             </w:r>
           </w:p>
         </w:tc>
@@ -2231,7 +2568,7 @@
               <w:rPr>
                 <w:sz w:val="16"/>
               </w:rPr>
-              <w:t>14:00–15:20</w:t>
+              <w:t>13:30–14:30</w:t>
             </w:r>
           </w:p>
         </w:tc>
@@ -2245,7 +2582,7 @@
               <w:rPr>
                 <w:sz w:val="16"/>
               </w:rPr>
-              <w:t>80 min</w:t>
+              <w:t>60 min</w:t>
             </w:r>
           </w:p>
         </w:tc>
@@ -2259,7 +2596,7 @@
               <w:rPr>
                 <w:sz w:val="16"/>
               </w:rPr>
-              <w:t>Topic 4 + Labs</w:t>
+              <w:t>Topic 4 + Lab</w:t>
             </w:r>
           </w:p>
         </w:tc>
@@ -2273,7 +2610,7 @@
               <w:rPr>
                 <w:sz w:val="16"/>
               </w:rPr>
-              <w:t>Colour fundamentals, adjustment layers, restoration and delivery; Labs 9–10</w:t>
+              <w:t>Lab 9: restoration, critique and colour</w:t>
             </w:r>
           </w:p>
         </w:tc>
@@ -2287,7 +2624,7 @@
               <w:rPr>
                 <w:sz w:val="16"/>
               </w:rPr>
-              <w:t>Topic 4: 84 · Labs: 103, 104</w:t>
+              <w:t>Lab slide: 199</w:t>
             </w:r>
           </w:p>
         </w:tc>
@@ -2306,7 +2643,7 @@
               <w:rPr>
                 <w:sz w:val="16"/>
               </w:rPr>
-              <w:t>15:20–15:40</w:t>
+              <w:t>14:30–14:45</w:t>
             </w:r>
           </w:p>
         </w:tc>
@@ -2320,7 +2657,157 @@
               <w:rPr>
                 <w:sz w:val="16"/>
               </w:rPr>
-              <w:t>20 min</w:t>
+              <w:t>15 min</w:t>
+            </w:r>
+          </w:p>
+        </w:tc>
+        <w:tc>
+          <w:tcPr>
+            <w:tcW w:type="dxa" w:w="1037"/>
+            <w:vAlign w:val="center"/>
+          </w:tcPr>
+          <w:p>
+            <w:r>
+              <w:rPr>
+                <w:sz w:val="16"/>
+              </w:rPr>
+              <w:t>Break</w:t>
+            </w:r>
+          </w:p>
+        </w:tc>
+        <w:tc>
+          <w:tcPr>
+            <w:tcW w:type="dxa" w:w="4104"/>
+            <w:vAlign w:val="center"/>
+          </w:tcPr>
+          <w:p>
+            <w:r>
+              <w:rPr>
+                <w:sz w:val="16"/>
+              </w:rPr>
+              <w:t>Tea break</w:t>
+            </w:r>
+          </w:p>
+        </w:tc>
+        <w:tc>
+          <w:tcPr>
+            <w:tcW w:type="dxa" w:w="2088"/>
+            <w:vAlign w:val="center"/>
+          </w:tcPr>
+          <w:p>
+            <w:r>
+              <w:rPr>
+                <w:sz w:val="16"/>
+              </w:rPr>
+              <w:t>—</w:t>
+            </w:r>
+          </w:p>
+        </w:tc>
+      </w:tr>
+      <w:tr>
+        <w:trPr>
+          <w:cantSplit/>
+        </w:trPr>
+        <w:tc>
+          <w:tcPr>
+            <w:tcW w:type="dxa" w:w="1037"/>
+            <w:vAlign w:val="center"/>
+          </w:tcPr>
+          <w:p>
+            <w:r>
+              <w:rPr>
+                <w:sz w:val="16"/>
+              </w:rPr>
+              <w:t>14:45–15:45</w:t>
+            </w:r>
+          </w:p>
+        </w:tc>
+        <w:tc>
+          <w:tcPr>
+            <w:tcW w:type="dxa" w:w="893"/>
+            <w:vAlign w:val="center"/>
+          </w:tcPr>
+          <w:p>
+            <w:r>
+              <w:rPr>
+                <w:sz w:val="16"/>
+              </w:rPr>
+              <w:t>60 min</w:t>
+            </w:r>
+          </w:p>
+        </w:tc>
+        <w:tc>
+          <w:tcPr>
+            <w:tcW w:type="dxa" w:w="1037"/>
+            <w:vAlign w:val="center"/>
+          </w:tcPr>
+          <w:p>
+            <w:r>
+              <w:rPr>
+                <w:sz w:val="16"/>
+              </w:rPr>
+              <w:t>Topic 4 + Lab</w:t>
+            </w:r>
+          </w:p>
+        </w:tc>
+        <w:tc>
+          <w:tcPr>
+            <w:tcW w:type="dxa" w:w="4104"/>
+            <w:vAlign w:val="center"/>
+          </w:tcPr>
+          <w:p>
+            <w:r>
+              <w:rPr>
+                <w:sz w:val="16"/>
+              </w:rPr>
+              <w:t>Lab 10 capstone and Topic 4 checkpoint</w:t>
+            </w:r>
+          </w:p>
+        </w:tc>
+        <w:tc>
+          <w:tcPr>
+            <w:tcW w:type="dxa" w:w="2088"/>
+            <w:vAlign w:val="center"/>
+          </w:tcPr>
+          <w:p>
+            <w:r>
+              <w:rPr>
+                <w:sz w:val="16"/>
+              </w:rPr>
+              <w:t>Lab slide: 200</w:t>
+            </w:r>
+          </w:p>
+        </w:tc>
+      </w:tr>
+      <w:tr>
+        <w:trPr>
+          <w:cantSplit/>
+        </w:trPr>
+        <w:tc>
+          <w:tcPr>
+            <w:tcW w:type="dxa" w:w="1037"/>
+            <w:vAlign w:val="center"/>
+          </w:tcPr>
+          <w:p>
+            <w:r>
+              <w:rPr>
+                <w:sz w:val="16"/>
+              </w:rPr>
+              <w:t>15:45–16:00</w:t>
+            </w:r>
+          </w:p>
+        </w:tc>
+        <w:tc>
+          <w:tcPr>
+            <w:tcW w:type="dxa" w:w="893"/>
+            <w:vAlign w:val="center"/>
+          </w:tcPr>
+          <w:p>
+            <w:r>
+              <w:rPr>
+                <w:sz w:val="16"/>
+              </w:rPr>
+              <w:t>15 min</w:t>
             </w:r>
           </w:p>
         </w:tc>
@@ -2348,7 +2835,7 @@
               <w:rPr>
                 <w:sz w:val="16"/>
               </w:rPr>
-              <w:t>Course recap, assessment briefing and transition</w:t>
+              <w:t>Course synthesis, assessment briefing and administration</w:t>
             </w:r>
           </w:p>
         </w:tc>
@@ -2381,7 +2868,7 @@
               <w:rPr>
                 <w:sz w:val="16"/>
               </w:rPr>
-              <w:t>15:40–16:40</w:t>
+              <w:t>16:00–17:00</w:t>
             </w:r>
           </w:p>
         </w:tc>
@@ -2456,7 +2943,7 @@
               <w:rPr>
                 <w:sz w:val="16"/>
               </w:rPr>
-              <w:t>16:40–17:40</w:t>
+              <w:t>17:00–18:00</w:t>
             </w:r>
           </w:p>
         </w:tc>
@@ -2513,81 +3000,6 @@
                 <w:sz w:val="16"/>
               </w:rPr>
               <w:t>4 tasks · A1–A7</w:t>
-            </w:r>
-          </w:p>
-        </w:tc>
-      </w:tr>
-      <w:tr>
-        <w:trPr>
-          <w:cantSplit/>
-        </w:trPr>
-        <w:tc>
-          <w:tcPr>
-            <w:tcW w:type="dxa" w:w="1037"/>
-            <w:vAlign w:val="center"/>
-          </w:tcPr>
-          <w:p>
-            <w:r>
-              <w:rPr>
-                <w:sz w:val="16"/>
-              </w:rPr>
-              <w:t>17:40–18:00</w:t>
-            </w:r>
-          </w:p>
-        </w:tc>
-        <w:tc>
-          <w:tcPr>
-            <w:tcW w:type="dxa" w:w="893"/>
-            <w:vAlign w:val="center"/>
-          </w:tcPr>
-          <w:p>
-            <w:r>
-              <w:rPr>
-                <w:sz w:val="16"/>
-              </w:rPr>
-              <w:t>20 min</w:t>
-            </w:r>
-          </w:p>
-        </w:tc>
-        <w:tc>
-          <w:tcPr>
-            <w:tcW w:type="dxa" w:w="1037"/>
-            <w:vAlign w:val="center"/>
-          </w:tcPr>
-          <w:p>
-            <w:r>
-              <w:rPr>
-                <w:sz w:val="16"/>
-              </w:rPr>
-              <w:t>Admin</w:t>
-            </w:r>
-          </w:p>
-        </w:tc>
-        <w:tc>
-          <w:tcPr>
-            <w:tcW w:type="dxa" w:w="4104"/>
-            <w:vAlign w:val="center"/>
-          </w:tcPr>
-          <w:p>
-            <w:r>
-              <w:rPr>
-                <w:sz w:val="16"/>
-              </w:rPr>
-              <w:t>Assessment attendance, feedback and close</w:t>
-            </w:r>
-          </w:p>
-        </w:tc>
-        <w:tc>
-          <w:tcPr>
-            <w:tcW w:type="dxa" w:w="2088"/>
-            <w:vAlign w:val="center"/>
-          </w:tcPr>
-          <w:p>
-            <w:r>
-              <w:rPr>
-                <w:sz w:val="16"/>
-              </w:rPr>
-              <w:t>Closing admin</w:t>
             </w:r>
           </w:p>
         </w:tc>
@@ -2731,7 +3143,7 @@
               <w:rPr>
                 <w:sz w:val="16"/>
               </w:rPr>
-              <w:t>37</w:t>
+              <w:t>61</w:t>
             </w:r>
           </w:p>
         </w:tc>
@@ -2792,7 +3204,7 @@
               <w:rPr>
                 <w:sz w:val="16"/>
               </w:rPr>
-              <w:t>38</w:t>
+              <w:t>62</w:t>
             </w:r>
           </w:p>
         </w:tc>
@@ -2853,7 +3265,7 @@
               <w:rPr>
                 <w:sz w:val="16"/>
               </w:rPr>
-              <w:t>58</w:t>
+              <w:t>106</w:t>
             </w:r>
           </w:p>
         </w:tc>
@@ -2914,7 +3326,7 @@
               <w:rPr>
                 <w:sz w:val="16"/>
               </w:rPr>
-              <w:t>59</w:t>
+              <w:t>107</w:t>
             </w:r>
           </w:p>
         </w:tc>
@@ -2975,7 +3387,7 @@
               <w:rPr>
                 <w:sz w:val="16"/>
               </w:rPr>
-              <w:t>79</w:t>
+              <w:t>151</w:t>
             </w:r>
           </w:p>
         </w:tc>
@@ -3036,7 +3448,7 @@
               <w:rPr>
                 <w:sz w:val="16"/>
               </w:rPr>
-              <w:t>80</w:t>
+              <w:t>152</w:t>
             </w:r>
           </w:p>
         </w:tc>
@@ -3097,7 +3509,7 @@
               <w:rPr>
                 <w:sz w:val="16"/>
               </w:rPr>
-              <w:t>81</w:t>
+              <w:t>153</w:t>
             </w:r>
           </w:p>
         </w:tc>
@@ -3158,7 +3570,7 @@
               <w:rPr>
                 <w:sz w:val="16"/>
               </w:rPr>
-              <w:t>82</w:t>
+              <w:t>154</w:t>
             </w:r>
           </w:p>
         </w:tc>
@@ -3219,7 +3631,7 @@
               <w:rPr>
                 <w:sz w:val="16"/>
               </w:rPr>
-              <w:t>103</w:t>
+              <w:t>199</w:t>
             </w:r>
           </w:p>
         </w:tc>
@@ -3280,7 +3692,7 @@
               <w:rPr>
                 <w:sz w:val="16"/>
               </w:rPr>
-              <w:t>104</w:t>
+              <w:t>200</w:t>
             </w:r>
           </w:p>
         </w:tc>

</xml_diff>